<commit_message>
worksheets: set live Module 2 URL + route guidance and no-URL clues per section
VERCEL_ROOT -> the live Day 2 deployment (one place). Every section now points at
a route: findItBox app-sections carry the full URL; paper sections gain an
'In the app (optional) · <route>' line via locationNote; the Playground map names
a concrete route per row and a 'Clue:' for how to do it without the app. Rebuilt
all four .docx.

Co-Authored-By: Claude Opus 4.8 <noreply@anthropic.com>
</commit_message>
<xml_diff>
--- a/worksheets/dist/Worksheet1_DataForm_L1.docx
+++ b/worksheets/dist/Worksheet1_DataForm_L1.docx
@@ -284,7 +284,7 @@
             <w:pPr>
               <w:spacing w:after="0"/>
             </w:pPr>
-            <w:hyperlink w:history="1" r:id="rIdkj9igxx7ayfsntphqttjw">
+            <w:hyperlink w:history="1" r:id="rIdad0jkvwrjhe8w1h2bhs1u">
               <w:r>
                 <w:rPr>
                   <w:rFonts w:ascii="Calibri" w:cs="Calibri" w:eastAsia="Calibri" w:hAnsi="Calibri"/>
@@ -295,7 +295,7 @@
                   <w:szCs w:val="20"/>
                   <w:u w:val="single"/>
                 </w:rPr>
-                <w:t xml:space="preserve">https://aion-green-it-day2.vercel.app/case/mediprint/</w:t>
+                <w:t xml:space="preserve">https://aion-green-it-day2-it-as-an-environ.vercel.app/case/mediprint/</w:t>
               </w:r>
             </w:hyperlink>
           </w:p>
@@ -361,7 +361,7 @@
             <w:pPr>
               <w:spacing w:after="0"/>
             </w:pPr>
-            <w:hyperlink w:history="1" r:id="rId-u2nq1bn5xfuly04ytly2">
+            <w:hyperlink w:history="1" r:id="rIdx6fm8k0jlvxmsyejpevp4">
               <w:r>
                 <w:rPr>
                   <w:rFonts w:ascii="Calibri" w:cs="Calibri" w:eastAsia="Calibri" w:hAnsi="Calibri"/>
@@ -372,7 +372,7 @@
                   <w:szCs w:val="20"/>
                   <w:u w:val="single"/>
                 </w:rPr>
-                <w:t xml:space="preserve">https://aion-green-it-day2.vercel.app/</w:t>
+                <w:t xml:space="preserve">https://aion-green-it-day2-it-as-an-environ.vercel.app/</w:t>
               </w:r>
             </w:hyperlink>
           </w:p>
@@ -2005,7 +2005,7 @@
                 <w:sz w:val="20"/>
                 <w:szCs w:val="20"/>
               </w:rPr>
-              <w:t xml:space="preserve">DataForm illustration — click each of the eight markers.</w:t>
+              <w:t xml:space="preserve">/case/mediprint — the DataForm illustration; click each of the eight markers.</w:t>
             </w:r>
           </w:p>
         </w:tc>
@@ -2112,42 +2112,42 @@
                 <w:sz w:val="20"/>
                 <w:szCs w:val="20"/>
               </w:rPr>
-              <w:t xml:space="preserve">No app viewing needed.</w:t>
-            </w:r>
-          </w:p>
-        </w:tc>
-        <w:tc>
-          <w:tcPr>
-            <w:tcBorders>
-              <w:top w:val="single" w:color="D9D3EA" w:sz="4"/>
-              <w:left w:val="single" w:color="D9D3EA" w:sz="4"/>
-              <w:bottom w:val="single" w:color="D9D3EA" w:sz="4"/>
-              <w:right w:val="single" w:color="D9D3EA" w:sz="4"/>
-            </w:tcBorders>
-            <w:tcMar>
-              <w:top w:type="dxa" w:w="80"/>
-              <w:left w:type="dxa" w:w="120"/>
-              <w:bottom w:type="dxa" w:w="80"/>
-              <w:right w:type="dxa" w:w="120"/>
-            </w:tcMar>
-            <w:vAlign w:val="top"/>
-          </w:tcPr>
-          <w:p>
-            <w:pPr>
-              <w:spacing w:after="0" w:before="0"/>
-            </w:pPr>
-            <w:r>
-              <w:rPr>
-                <w:rFonts w:ascii="Calibri" w:cs="Calibri" w:eastAsia="Calibri" w:hAnsi="Calibri"/>
-                <w:b w:val="false"/>
-                <w:bCs w:val="false"/>
-                <w:i w:val="false"/>
-                <w:iCs w:val="false"/>
-                <w:color w:val="1B1230"/>
-                <w:sz w:val="20"/>
-                <w:szCs w:val="20"/>
-              </w:rPr>
-              <w:t xml:space="preserve">Assign each observation to one of the five areas and tally.</w:t>
+              <w:t xml:space="preserve">/case/mediprint — the five area bands (or /learn → “Area sorter”). Optional — the reference has all you need.</w:t>
+            </w:r>
+          </w:p>
+        </w:tc>
+        <w:tc>
+          <w:tcPr>
+            <w:tcBorders>
+              <w:top w:val="single" w:color="D9D3EA" w:sz="4"/>
+              <w:left w:val="single" w:color="D9D3EA" w:sz="4"/>
+              <w:bottom w:val="single" w:color="D9D3EA" w:sz="4"/>
+              <w:right w:val="single" w:color="D9D3EA" w:sz="4"/>
+            </w:tcBorders>
+            <w:tcMar>
+              <w:top w:type="dxa" w:w="80"/>
+              <w:left w:type="dxa" w:w="120"/>
+              <w:bottom w:type="dxa" w:w="80"/>
+              <w:right w:type="dxa" w:w="120"/>
+            </w:tcMar>
+            <w:vAlign w:val="top"/>
+          </w:tcPr>
+          <w:p>
+            <w:pPr>
+              <w:spacing w:after="0" w:before="0"/>
+            </w:pPr>
+            <w:r>
+              <w:rPr>
+                <w:rFonts w:ascii="Calibri" w:cs="Calibri" w:eastAsia="Calibri" w:hAnsi="Calibri"/>
+                <w:b w:val="false"/>
+                <w:bCs w:val="false"/>
+                <w:i w:val="false"/>
+                <w:iCs w:val="false"/>
+                <w:color w:val="1B1230"/>
+                <w:sz w:val="20"/>
+                <w:szCs w:val="20"/>
+              </w:rPr>
+              <w:t xml:space="preserve">Clue: assign by the lever you would pull. Running/idling → Operations; buying → Procurement; a habit/default → Use; swap timing → Replacement; sitting unused → Storage.</w:t>
             </w:r>
           </w:p>
         </w:tc>
@@ -2219,42 +2219,42 @@
                 <w:sz w:val="20"/>
                 <w:szCs w:val="20"/>
               </w:rPr>
-              <w:t xml:space="preserve">No app viewing needed.</w:t>
-            </w:r>
-          </w:p>
-        </w:tc>
-        <w:tc>
-          <w:tcPr>
-            <w:tcBorders>
-              <w:top w:val="single" w:color="D9D3EA" w:sz="4"/>
-              <w:left w:val="single" w:color="D9D3EA" w:sz="4"/>
-              <w:bottom w:val="single" w:color="D9D3EA" w:sz="4"/>
-              <w:right w:val="single" w:color="D9D3EA" w:sz="4"/>
-            </w:tcBorders>
-            <w:tcMar>
-              <w:top w:type="dxa" w:w="80"/>
-              <w:left w:type="dxa" w:w="120"/>
-              <w:bottom w:type="dxa" w:w="80"/>
-              <w:right w:type="dxa" w:w="120"/>
-            </w:tcMar>
-            <w:vAlign w:val="top"/>
-          </w:tcPr>
-          <w:p>
-            <w:pPr>
-              <w:spacing w:after="0" w:before="0"/>
-            </w:pPr>
-            <w:r>
-              <w:rPr>
-                <w:rFonts w:ascii="Calibri" w:cs="Calibri" w:eastAsia="Calibri" w:hAnsi="Calibri"/>
-                <w:b w:val="false"/>
-                <w:bCs w:val="false"/>
-                <w:i w:val="false"/>
-                <w:iCs w:val="false"/>
-                <w:color w:val="1B1230"/>
-                <w:sz w:val="20"/>
-                <w:szCs w:val="20"/>
-              </w:rPr>
-              <w:t xml:space="preserve">Write one first improvement per area.</w:t>
+              <w:t xml:space="preserve">/case/mediprint — the five area bands (optional).</w:t>
+            </w:r>
+          </w:p>
+        </w:tc>
+        <w:tc>
+          <w:tcPr>
+            <w:tcBorders>
+              <w:top w:val="single" w:color="D9D3EA" w:sz="4"/>
+              <w:left w:val="single" w:color="D9D3EA" w:sz="4"/>
+              <w:bottom w:val="single" w:color="D9D3EA" w:sz="4"/>
+              <w:right w:val="single" w:color="D9D3EA" w:sz="4"/>
+            </w:tcBorders>
+            <w:tcMar>
+              <w:top w:type="dxa" w:w="80"/>
+              <w:left w:type="dxa" w:w="120"/>
+              <w:bottom w:type="dxa" w:w="80"/>
+              <w:right w:type="dxa" w:w="120"/>
+            </w:tcMar>
+            <w:vAlign w:val="top"/>
+          </w:tcPr>
+          <w:p>
+            <w:pPr>
+              <w:spacing w:after="0" w:before="0"/>
+            </w:pPr>
+            <w:r>
+              <w:rPr>
+                <w:rFonts w:ascii="Calibri" w:cs="Calibri" w:eastAsia="Calibri" w:hAnsi="Calibri"/>
+                <w:b w:val="false"/>
+                <w:bCs w:val="false"/>
+                <w:i w:val="false"/>
+                <w:iCs w:val="false"/>
+                <w:color w:val="1B1230"/>
+                <w:sz w:val="20"/>
+                <w:szCs w:val="20"/>
+              </w:rPr>
+              <w:t xml:space="preserve">Clue: write the change (a rule, a schedule, a reuse route), not a measurement.</w:t>
             </w:r>
           </w:p>
         </w:tc>
@@ -2326,42 +2326,42 @@
                 <w:sz w:val="20"/>
                 <w:szCs w:val="20"/>
               </w:rPr>
-              <w:t xml:space="preserve">No app viewing needed.</w:t>
-            </w:r>
-          </w:p>
-        </w:tc>
-        <w:tc>
-          <w:tcPr>
-            <w:tcBorders>
-              <w:top w:val="single" w:color="D9D3EA" w:sz="4"/>
-              <w:left w:val="single" w:color="D9D3EA" w:sz="4"/>
-              <w:bottom w:val="single" w:color="D9D3EA" w:sz="4"/>
-              <w:right w:val="single" w:color="D9D3EA" w:sz="4"/>
-            </w:tcBorders>
-            <w:tcMar>
-              <w:top w:type="dxa" w:w="80"/>
-              <w:left w:type="dxa" w:w="120"/>
-              <w:bottom w:type="dxa" w:w="80"/>
-              <w:right w:type="dxa" w:w="120"/>
-            </w:tcMar>
-            <w:vAlign w:val="top"/>
-          </w:tcPr>
-          <w:p>
-            <w:pPr>
-              <w:spacing w:after="0" w:before="0"/>
-            </w:pPr>
-            <w:r>
-              <w:rPr>
-                <w:rFonts w:ascii="Calibri" w:cs="Calibri" w:eastAsia="Calibri" w:hAnsi="Calibri"/>
-                <w:b w:val="false"/>
-                <w:bCs w:val="false"/>
-                <w:i w:val="false"/>
-                <w:iCs w:val="false"/>
-                <w:color w:val="1B1230"/>
-                <w:sz w:val="20"/>
-                <w:szCs w:val="20"/>
-              </w:rPr>
-              <w:t xml:space="preserve">Decide individual / technical vs structural / management.</w:t>
+              <w:t xml:space="preserve">/case/mediprint — Task 1, step 5 asks the same thing (optional).</w:t>
+            </w:r>
+          </w:p>
+        </w:tc>
+        <w:tc>
+          <w:tcPr>
+            <w:tcBorders>
+              <w:top w:val="single" w:color="D9D3EA" w:sz="4"/>
+              <w:left w:val="single" w:color="D9D3EA" w:sz="4"/>
+              <w:bottom w:val="single" w:color="D9D3EA" w:sz="4"/>
+              <w:right w:val="single" w:color="D9D3EA" w:sz="4"/>
+            </w:tcBorders>
+            <w:tcMar>
+              <w:top w:type="dxa" w:w="80"/>
+              <w:left w:type="dxa" w:w="120"/>
+              <w:bottom w:type="dxa" w:w="80"/>
+              <w:right w:type="dxa" w:w="120"/>
+            </w:tcMar>
+            <w:vAlign w:val="top"/>
+          </w:tcPr>
+          <w:p>
+            <w:pPr>
+              <w:spacing w:after="0" w:before="0"/>
+            </w:pPr>
+            <w:r>
+              <w:rPr>
+                <w:rFonts w:ascii="Calibri" w:cs="Calibri" w:eastAsia="Calibri" w:hAnsi="Calibri"/>
+                <w:b w:val="false"/>
+                <w:bCs w:val="false"/>
+                <w:i w:val="false"/>
+                <w:iCs w:val="false"/>
+                <w:color w:val="1B1230"/>
+                <w:sz w:val="20"/>
+                <w:szCs w:val="20"/>
+              </w:rPr>
+              <w:t xml:space="preserve">Clue: can one team fix it next month → technical; needs a rule/budget/decision → structural.</w:t>
             </w:r>
           </w:p>
         </w:tc>
@@ -2554,7 +2554,7 @@
                 <w:sz w:val="20"/>
                 <w:szCs w:val="20"/>
               </w:rPr>
-              <w:t xml:space="preserve">https://aion-green-it-day2.vercel.app/case/mediprint/ — the DataForm building illustration. Click each numbered marker.</w:t>
+              <w:t xml:space="preserve">https://aion-green-it-day2-it-as-an-environ.vercel.app/case/mediprint/ — the DataForm building illustration. Click each numbered marker.</w:t>
             </w:r>
           </w:p>
           <w:p>
@@ -4463,7 +4463,7 @@
           </w:tcPr>
           <w:p>
             <w:pPr>
-              <w:spacing w:after="0" w:before="0"/>
+              <w:spacing w:after="40" w:before="0"/>
             </w:pPr>
             <w:r>
               <w:rPr>
@@ -4489,7 +4489,38 @@
                 <w:sz w:val="20"/>
                 <w:szCs w:val="20"/>
               </w:rPr>
-              <w:t xml:space="preserve">Answered from this sheet. Use the on-screen labels (H1..H8) from Section A. Each observation sits in exactly one area.</w:t>
+              <w:t xml:space="preserve">Answered from this sheet. Use the labels (H1..H8) from Section A. Each observation sits in exactly one area. Clue — decide by the lever you would pull, not the object.</w:t>
+            </w:r>
+          </w:p>
+          <w:p>
+            <w:pPr>
+              <w:spacing w:after="0" w:before="0"/>
+            </w:pPr>
+            <w:r>
+              <w:rPr>
+                <w:rFonts w:ascii="Calibri" w:cs="Calibri" w:eastAsia="Calibri" w:hAnsi="Calibri"/>
+                <w:b/>
+                <w:bCs/>
+                <w:i/>
+                <w:iCs/>
+                <w:color w:val="6B6484"/>
+                <w:sz w:val="18"/>
+                <w:szCs w:val="18"/>
+              </w:rPr>
+              <w:t xml:space="preserve">In the app (optional) · </w:t>
+            </w:r>
+            <w:r>
+              <w:rPr>
+                <w:rFonts w:ascii="Calibri" w:cs="Calibri" w:eastAsia="Calibri" w:hAnsi="Calibri"/>
+                <w:b w:val="false"/>
+                <w:bCs w:val="false"/>
+                <w:i/>
+                <w:iCs/>
+                <w:color w:val="6B6484"/>
+                <w:sz w:val="18"/>
+                <w:szCs w:val="18"/>
+              </w:rPr>
+              <w:t xml:space="preserve">https://aion-green-it-day2-it-as-an-environ.vercel.app/case/mediprint/ (the area bands) · https://aion-green-it-day2-it-as-an-environ.vercel.app/learn/ (the “Area sorter” teaches the five areas)</w:t>
             </w:r>
           </w:p>
         </w:tc>
@@ -5734,7 +5765,7 @@
           </w:tcPr>
           <w:p>
             <w:pPr>
-              <w:spacing w:after="0" w:before="0"/>
+              <w:spacing w:after="40" w:before="0"/>
             </w:pPr>
             <w:r>
               <w:rPr>
@@ -5761,6 +5792,37 @@
                 <w:szCs w:val="20"/>
               </w:rPr>
               <w:t xml:space="preserve">Answered from this sheet. One approach per area is enough — say what you would change, not what you would measure.</w:t>
+            </w:r>
+          </w:p>
+          <w:p>
+            <w:pPr>
+              <w:spacing w:after="0" w:before="0"/>
+            </w:pPr>
+            <w:r>
+              <w:rPr>
+                <w:rFonts w:ascii="Calibri" w:cs="Calibri" w:eastAsia="Calibri" w:hAnsi="Calibri"/>
+                <w:b/>
+                <w:bCs/>
+                <w:i/>
+                <w:iCs/>
+                <w:color w:val="6B6484"/>
+                <w:sz w:val="18"/>
+                <w:szCs w:val="18"/>
+              </w:rPr>
+              <w:t xml:space="preserve">In the app (optional) · </w:t>
+            </w:r>
+            <w:r>
+              <w:rPr>
+                <w:rFonts w:ascii="Calibri" w:cs="Calibri" w:eastAsia="Calibri" w:hAnsi="Calibri"/>
+                <w:b w:val="false"/>
+                <w:bCs w:val="false"/>
+                <w:i/>
+                <w:iCs/>
+                <w:color w:val="6B6484"/>
+                <w:sz w:val="18"/>
+                <w:szCs w:val="18"/>
+              </w:rPr>
+              <w:t xml:space="preserve">https://aion-green-it-day2-it-as-an-environ.vercel.app/case/mediprint/ — the five area bands</w:t>
             </w:r>
           </w:p>
         </w:tc>
@@ -6419,7 +6481,7 @@
           </w:tcPr>
           <w:p>
             <w:pPr>
-              <w:spacing w:after="0" w:before="0"/>
+              <w:spacing w:after="40" w:before="0"/>
             </w:pPr>
             <w:r>
               <w:rPr>
@@ -6446,6 +6508,37 @@
                 <w:szCs w:val="20"/>
               </w:rPr>
               <w:t xml:space="preserve">Answered from this sheet — the same eight observations as Section A, pre-filled below.</w:t>
+            </w:r>
+          </w:p>
+          <w:p>
+            <w:pPr>
+              <w:spacing w:after="0" w:before="0"/>
+            </w:pPr>
+            <w:r>
+              <w:rPr>
+                <w:rFonts w:ascii="Calibri" w:cs="Calibri" w:eastAsia="Calibri" w:hAnsi="Calibri"/>
+                <w:b/>
+                <w:bCs/>
+                <w:i/>
+                <w:iCs/>
+                <w:color w:val="6B6484"/>
+                <w:sz w:val="18"/>
+                <w:szCs w:val="18"/>
+              </w:rPr>
+              <w:t xml:space="preserve">In the app (optional) · </w:t>
+            </w:r>
+            <w:r>
+              <w:rPr>
+                <w:rFonts w:ascii="Calibri" w:cs="Calibri" w:eastAsia="Calibri" w:hAnsi="Calibri"/>
+                <w:b w:val="false"/>
+                <w:bCs w:val="false"/>
+                <w:i/>
+                <w:iCs/>
+                <w:color w:val="6B6484"/>
+                <w:sz w:val="18"/>
+                <w:szCs w:val="18"/>
+              </w:rPr>
+              <w:t xml:space="preserve">https://aion-green-it-day2-it-as-an-environ.vercel.app/case/mediprint/ — Task 1, step 5</w:t>
             </w:r>
           </w:p>
         </w:tc>

</xml_diff>

<commit_message>
Rename case routes to match their displayed names
The nav, page titles and worksheets all said DataForm/NetCore/Artemis,
but the routes still carried the Day 1 slugs (mediprint/nordcom/auron)
kept for "stable links" — visible in the address bar and confusing to
follow. Rename the routes to /case/dataform, /case/netcore,
/case/artemis and update every reference: nav.ts, task-map.ts,
lib/completion.ts, and the embedded playground URLs in all four
worksheet build scripts (docx rebuilt with the corrected links).
Component/data file names are left as-is — internal ids nobody sees.

Also update MASTER-PROMPT F28 so a future fork renames the route in
the same commit as the case name, instead of repeating this.
</commit_message>
<xml_diff>
--- a/worksheets/dist/Worksheet1_DataForm_L1.docx
+++ b/worksheets/dist/Worksheet1_DataForm_L1.docx
@@ -284,7 +284,7 @@
             <w:pPr>
               <w:spacing w:after="0"/>
             </w:pPr>
-            <w:hyperlink w:history="1" r:id="rIdad0jkvwrjhe8w1h2bhs1u">
+            <w:hyperlink w:history="1" r:id="rIdj2m4jaitme8sjnabdb4bd">
               <w:r>
                 <w:rPr>
                   <w:rFonts w:ascii="Calibri" w:cs="Calibri" w:eastAsia="Calibri" w:hAnsi="Calibri"/>
@@ -295,7 +295,7 @@
                   <w:szCs w:val="20"/>
                   <w:u w:val="single"/>
                 </w:rPr>
-                <w:t xml:space="preserve">https://aion-green-it-day2-it-as-an-environ.vercel.app/case/mediprint/</w:t>
+                <w:t xml:space="preserve">https://aion-green-it-day2-it-as-an-environ.vercel.app/case/dataform/</w:t>
               </w:r>
             </w:hyperlink>
           </w:p>
@@ -361,7 +361,7 @@
             <w:pPr>
               <w:spacing w:after="0"/>
             </w:pPr>
-            <w:hyperlink w:history="1" r:id="rIdx6fm8k0jlvxmsyejpevp4">
+            <w:hyperlink w:history="1" r:id="rIdhxw-lmyxzs7wgajfh3zat">
               <w:r>
                 <w:rPr>
                   <w:rFonts w:ascii="Calibri" w:cs="Calibri" w:eastAsia="Calibri" w:hAnsi="Calibri"/>
@@ -2005,7 +2005,7 @@
                 <w:sz w:val="20"/>
                 <w:szCs w:val="20"/>
               </w:rPr>
-              <w:t xml:space="preserve">/case/mediprint — the DataForm illustration; click each of the eight markers.</w:t>
+              <w:t xml:space="preserve">/case/dataform — the DataForm illustration; click each of the eight markers.</w:t>
             </w:r>
           </w:p>
         </w:tc>
@@ -2112,7 +2112,7 @@
                 <w:sz w:val="20"/>
                 <w:szCs w:val="20"/>
               </w:rPr>
-              <w:t xml:space="preserve">/case/mediprint — the five area bands (or /learn → “Area sorter”). Optional — the reference has all you need.</w:t>
+              <w:t xml:space="preserve">/case/dataform — the five area bands (or /learn → “Area sorter”). Optional — the reference has all you need.</w:t>
             </w:r>
           </w:p>
         </w:tc>
@@ -2219,7 +2219,7 @@
                 <w:sz w:val="20"/>
                 <w:szCs w:val="20"/>
               </w:rPr>
-              <w:t xml:space="preserve">/case/mediprint — the five area bands (optional).</w:t>
+              <w:t xml:space="preserve">/case/dataform — the five area bands (optional).</w:t>
             </w:r>
           </w:p>
         </w:tc>
@@ -2326,7 +2326,7 @@
                 <w:sz w:val="20"/>
                 <w:szCs w:val="20"/>
               </w:rPr>
-              <w:t xml:space="preserve">/case/mediprint — Task 1, step 5 asks the same thing (optional).</w:t>
+              <w:t xml:space="preserve">/case/dataform — Task 1, step 5 asks the same thing (optional).</w:t>
             </w:r>
           </w:p>
         </w:tc>
@@ -2554,7 +2554,7 @@
                 <w:sz w:val="20"/>
                 <w:szCs w:val="20"/>
               </w:rPr>
-              <w:t xml:space="preserve">https://aion-green-it-day2-it-as-an-environ.vercel.app/case/mediprint/ — the DataForm building illustration. Click each numbered marker.</w:t>
+              <w:t xml:space="preserve">https://aion-green-it-day2-it-as-an-environ.vercel.app/case/dataform/ — the DataForm building illustration. Click each numbered marker.</w:t>
             </w:r>
           </w:p>
           <w:p>
@@ -4520,7 +4520,7 @@
                 <w:sz w:val="18"/>
                 <w:szCs w:val="18"/>
               </w:rPr>
-              <w:t xml:space="preserve">https://aion-green-it-day2-it-as-an-environ.vercel.app/case/mediprint/ (the area bands) · https://aion-green-it-day2-it-as-an-environ.vercel.app/learn/ (the “Area sorter” teaches the five areas)</w:t>
+              <w:t xml:space="preserve">https://aion-green-it-day2-it-as-an-environ.vercel.app/case/dataform/ (the area bands) · https://aion-green-it-day2-it-as-an-environ.vercel.app/learn/ (the “Area sorter” teaches the five areas)</w:t>
             </w:r>
           </w:p>
         </w:tc>
@@ -5822,7 +5822,7 @@
                 <w:sz w:val="18"/>
                 <w:szCs w:val="18"/>
               </w:rPr>
-              <w:t xml:space="preserve">https://aion-green-it-day2-it-as-an-environ.vercel.app/case/mediprint/ — the five area bands</w:t>
+              <w:t xml:space="preserve">https://aion-green-it-day2-it-as-an-environ.vercel.app/case/dataform/ — the five area bands</w:t>
             </w:r>
           </w:p>
         </w:tc>
@@ -6538,7 +6538,7 @@
                 <w:sz w:val="18"/>
                 <w:szCs w:val="18"/>
               </w:rPr>
-              <w:t xml:space="preserve">https://aion-green-it-day2-it-as-an-environ.vercel.app/case/mediprint/ — Task 1, step 5</w:t>
+              <w:t xml:space="preserve">https://aion-green-it-day2-it-as-an-environ.vercel.app/case/dataform/ — Task 1, step 5</w:t>
             </w:r>
           </w:p>
         </w:tc>

</xml_diff>